<commit_message>
chore: release 2.6.1 (patch: E3 figure correction, audit runner, SSRN r32)
Bump the active release from 2.6.0 to 2.6.1 wherever it names the current
version: README (title, versioning note with what 2.6.1 adds, footer,
BibTeX, tree), CITATION.cff, sources.md, dashboard, CONTRIBUTING.md,
corpus README, and the SSRN r32 manuscripts and form text (PDF/DOCX
re-rendered). Mentions of what 2.6.0 added are kept. CHANGELOG: the
unreleased section becomes [2.6.1] (PR #47 to #49).

Co-Authored-By: Claude Opus 5.5 <noreply@anthropic.com>
Claude-Session: https://claude.ai/code/session_01MqyBgMdshDotbsa5MmPnyF
</commit_message>
<xml_diff>
--- a/papers/snt_ssrn_v32.docx
+++ b/papers/snt_ssrn_v32.docx
@@ -7,7 +7,7 @@
         <w:pStyle w:val="Heading1"/>
       </w:pPr>
       <w:r>
-        <w:t>Shadow Node Theory v2.6.0 (manuscrito r32):</w:t>
+        <w:t>Shadow Node Theory v2.6.1 (manuscrito r32):</w:t>
       </w:r>
     </w:p>
     <w:p>
@@ -54,7 +54,7 @@
       </w:r>
       <w:r>
         <w:rPr/>
-        <w:t xml:space="preserve">Pre-print, revisión del manuscrito r32 (2026-09-27; sustituye a la v30 publicada el 2026-06-28 e incorpora la r31, una revisión intermedia preparada el mismo día y no publicada) — release del repositorio v2.6.0 — no arbitrado. Datos y metodología disponibles para revisión. Versión en español de </w:t>
+        <w:t xml:space="preserve">Pre-print, revisión del manuscrito r32 (2026-09-27; sustituye a la v30 publicada el 2026-06-28 e incorpora la r31, una revisión intermedia preparada el mismo día y no publicada) — release del repositorio v2.6.1 — no arbitrado. Datos y metodología disponibles para revisión. Versión en español de </w:t>
       </w:r>
       <w:r>
         <w:rPr>
@@ -261,7 +261,7 @@
           <w:p>
             <w:r>
               <w:rPr/>
-              <w:t>https://doi.org/10.5281/zenodo.19446521 (paquete v2.5.0; repositorio activo en release v2.6.0)</w:t>
+              <w:t>https://doi.org/10.5281/zenodo.19446521 (paquete v2.5.0; repositorio activo en release v2.6.1)</w:t>
             </w:r>
           </w:p>
         </w:tc>
@@ -3531,7 +3531,7 @@
     <w:p>
       <w:r>
         <w:rPr/>
-        <w:t>Zainos Corona, E. (2026). Shadow Node Theory — Replication Package v2.5.0 (721-case real corpus + Coupled Collapse layer ACO-A). Zenodo. https://doi.org/10.5281/zenodo.19446521. Repositorio actual (release v2.6.0, auditoría integral v32, prueba discriminante y reconstrucción del dominio B, pre-registro del 2026-09-27 y sus resultados): https://github.com/Inzainos/The-shadow-Node-Theory</w:t>
+        <w:t>Zainos Corona, E. (2026). Shadow Node Theory — Replication Package v2.5.0 (721-case real corpus + Coupled Collapse layer ACO-A). Zenodo. https://doi.org/10.5281/zenodo.19446521. Repositorio actual (release v2.6.1, auditoría integral v32, prueba discriminante y reconstrucción del dominio B, pre-registro del 2026-09-27 y sus resultados): https://github.com/Inzainos/The-shadow-Node-Theory</w:t>
       </w:r>
     </w:p>
     <w:p>
@@ -3596,7 +3596,7 @@
         <w:rPr>
           <w:i/>
         </w:rPr>
-        <w:t>— Fractal Core Research — Pre-print, revisión del manuscrito r32 (2026-09-27), release del repositorio v2.6.0 — Tlaxcala, México — 2026 —</w:t>
+        <w:t>— Fractal Core Research — Pre-print, revisión del manuscrito r32 (2026-09-27), release del repositorio v2.6.1 — Tlaxcala, México — 2026 —</w:t>
       </w:r>
     </w:p>
     <w:sectPr>

</xml_diff>